<commit_message>
feat(v0.16.0): meeting practice — new meeting-host persona (Olivia) + 2 original meeting question sets (general business meetings / beauty industry); meeting-aware feedback & sample answers; user guide updated to v0.16 (21 pp)
</commit_message>
<xml_diff>
--- a/docs/USER-GUIDE.docx
+++ b/docs/USER-GUIDE.docx
@@ -78,7 +78,7 @@
           <w:color w:val="6B7280"/>
           <w:sz w:val="20"/>
         </w:rPr>
-        <w:t>本地运行的 AI 英语面试训练器　·　v0.12 · 2026-09</w:t>
+        <w:t>本地运行的 AI 英语面试训练器　·　v0.16 · 2026-09</w:t>
       </w:r>
     </w:p>
     <w:p>
@@ -141,7 +141,7 @@
         <w:rPr>
           <w:sz w:val="21"/>
         </w:rPr>
-        <w:t>3  功能详解（九个功能逐项图解）</w:t>
+        <w:t>3  功能详解（十个功能逐项图解）</w:t>
       </w:r>
     </w:p>
     <w:p>
@@ -227,7 +227,7 @@
       <w:r>
         <w:drawing>
           <wp:inline xmlns:a="http://schemas.openxmlformats.org/drawingml/2006/main" xmlns:pic="http://schemas.openxmlformats.org/drawingml/2006/picture">
-            <wp:extent cx="4896000" cy="5688686"/>
+            <wp:extent cx="4896000" cy="8224114"/>
             <wp:docPr id="2" name="Picture 2"/>
             <wp:cNvGraphicFramePr>
               <a:graphicFrameLocks noChangeAspect="1"/>
@@ -248,7 +248,7 @@
                   <pic:spPr>
                     <a:xfrm>
                       <a:off x="0" y="0"/>
-                      <a:ext cx="4896000" cy="5688686"/>
+                      <a:ext cx="4896000" cy="8224114"/>
                     </a:xfrm>
                     <a:prstGeom prst="rect"/>
                   </pic:spPr>
@@ -384,7 +384,7 @@
           </w:tcPr>
           <w:p>
             <w:r>
-              <w:t>三种面试官人格，点击选中并试听音色</w:t>
+              <w:t>四种角色：3 位面试官 + 1 位会议主持人，点击选中并试听音色</w:t>
             </w:r>
           </w:p>
         </w:tc>
@@ -416,7 +416,7 @@
           </w:tcPr>
           <w:p>
             <w:r>
-              <w:t>基线 8 题 / 核心面试题集 / 外企 60 题</w:t>
+              <w:t>面试题集（基线 / 核心 / 外企 60 题）+ 会议题集（外企会议 / 美妆行业），共 5 套</w:t>
             </w:r>
           </w:p>
         </w:tc>
@@ -558,7 +558,7 @@
       <w:r>
         <w:drawing>
           <wp:inline xmlns:a="http://schemas.openxmlformats.org/drawingml/2006/main" xmlns:pic="http://schemas.openxmlformats.org/drawingml/2006/picture">
-            <wp:extent cx="5256000" cy="3222429"/>
+            <wp:extent cx="5256000" cy="2915829"/>
             <wp:docPr id="3" name="Picture 3"/>
             <wp:cNvGraphicFramePr>
               <a:graphicFrameLocks noChangeAspect="1"/>
@@ -579,7 +579,7 @@
                   <pic:spPr>
                     <a:xfrm>
                       <a:off x="0" y="0"/>
-                      <a:ext cx="5256000" cy="3222429"/>
+                      <a:ext cx="5256000" cy="2915829"/>
                     </a:xfrm>
                     <a:prstGeom prst="rect"/>
                   </pic:spPr>
@@ -619,12 +619,12 @@
     </w:p>
     <w:p>
       <w:r>
-        <w:t>2. 选择导师：在「选择你的 AI 导师」里点选一位（可先点「▶ 试听」听音色）。新用户建议从温和 HR 的 Grace 开始。</w:t>
+        <w:t>2. 选择导师：在「选择你的 AI 导师」里点选一位（可先点「▶ 试听」听音色）。面试新用户建议从温和 HR 的 Grace 开始；想练开会英语的，选「Olivia · 会议主持人」。</w:t>
       </w:r>
     </w:p>
     <w:p>
       <w:r>
-        <w:t>3. 选择题集：新用户从「基线 8 题」开始，先摸个底。</w:t>
+        <w:t>3. 选择题集：新用户从「基线 8 题」先摸底；练会议选「外企会议通用 16 题」或「美妆行业会议 22 题」。</w:t>
       </w:r>
     </w:p>
     <w:p>
@@ -730,7 +730,7 @@
         <w:pStyle w:val="ListBullet"/>
       </w:pPr>
       <w:r>
-        <w:t>3 种面试官人格：外企 HR 初面（行为面）/ 技术主管面（研究深挖）/ 压力面（终面）——人格含明确定位、评估维度与真实面试对话示例，追问贴合轮次；3 套题集：基线 8 题、核心面试题集、外企 60 题。</w:t>
+        <w:t>4 种角色：3 位面试官（HR 初面 / 技术主管 / 压力面）+ 1 位会议主持人（跨部门会议）——人格含明确定位、评估维度与真实对话示例，追问贴合场景；5 套题集：基线 8 题、核心面试题集、外企 60 题 + 外企会议通用 16 题、美妆行业会议 22 题。</w:t>
       </w:r>
     </w:p>
     <w:p>
@@ -1438,7 +1438,7 @@
         <w:pStyle w:val="ListBullet"/>
       </w:pPr>
       <w:r>
-        <w:t>三套题集共 82 题；也可以通过简单的 YAML 自定义题库（materials/question-bank/）。</w:t>
+        <w:t>五套题集共 120 题（面试 82 + 会议 38）；也可以通过简单的 YAML 自定义题库（materials/question-bank/）。</w:t>
       </w:r>
     </w:p>
     <w:p>
@@ -1703,6 +1703,92 @@
       </w:pPr>
       <w:r>
         <w:t>复习比例可在 app/config.yaml 的 review 一节调整（ratio / min_per_day / max_per_day）。</w:t>
+      </w:r>
+    </w:p>
+    <w:p>
+      <w:pPr>
+        <w:pStyle w:val="Heading2"/>
+      </w:pPr>
+      <w:r>
+        <w:t>3.10  会议练习（外企开会）</w:t>
+      </w:r>
+    </w:p>
+    <w:p>
+      <w:pPr>
+        <w:spacing w:before="120" w:after="40"/>
+        <w:jc w:val="center"/>
+      </w:pPr>
+      <w:r>
+        <w:drawing>
+          <wp:inline xmlns:a="http://schemas.openxmlformats.org/drawingml/2006/main" xmlns:pic="http://schemas.openxmlformats.org/drawingml/2006/picture">
+            <wp:extent cx="5472000" cy="4573029"/>
+            <wp:docPr id="19" name="Picture 19"/>
+            <wp:cNvGraphicFramePr>
+              <a:graphicFrameLocks noChangeAspect="1"/>
+            </wp:cNvGraphicFramePr>
+            <a:graphic>
+              <a:graphicData uri="http://schemas.openxmlformats.org/drawingml/2006/picture">
+                <pic:pic>
+                  <pic:nvPicPr>
+                    <pic:cNvPr id="0" name="fig_meeting.png"/>
+                    <pic:cNvPicPr/>
+                  </pic:nvPicPr>
+                  <pic:blipFill>
+                    <a:blip r:embed="rId28"/>
+                    <a:stretch>
+                      <a:fillRect/>
+                    </a:stretch>
+                  </pic:blipFill>
+                  <pic:spPr>
+                    <a:xfrm>
+                      <a:off x="0" y="0"/>
+                      <a:ext cx="5472000" cy="4573029"/>
+                    </a:xfrm>
+                    <a:prstGeom prst="rect"/>
+                  </pic:spPr>
+                </pic:pic>
+              </a:graphicData>
+            </a:graphic>
+          </wp:inline>
+        </w:drawing>
+      </w:r>
+    </w:p>
+    <w:p>
+      <w:pPr>
+        <w:spacing w:after="180"/>
+        <w:jc w:val="center"/>
+      </w:pPr>
+      <w:r>
+        <w:rPr>
+          <w:rFonts w:ascii="Microsoft YaHei" w:hAnsi="Microsoft YaHei" w:eastAsia="微软雅黑"/>
+          <w:color w:val="6B7280"/>
+          <w:sz w:val="17"/>
+        </w:rPr>
+        <w:t>会议练习：选「Olivia · 会议主持人」+ 会议题集——主持人给议程、点名发言、追问数字与行动项；反馈 / 示范答案 / 复盘 / 打卡等全部功能与面试练习一致</w:t>
+      </w:r>
+    </w:p>
+    <w:p>
+      <w:pPr>
+        <w:pStyle w:val="ListBullet"/>
+      </w:pPr>
+      <w:r>
+        <w:t>两个会议题集：「外企会议通用 16 题」（周会同步 / 数据表达 / 异议协商 / 决策收尾）+「美妆行业会议 22 题」（新品上市 / 渠道营销 / 供应链 / 合规可持续 / 业务复盘），全部原创编写。</w:t>
+      </w:r>
+    </w:p>
+    <w:p>
+      <w:pPr>
+        <w:pStyle w:val="ListBullet"/>
+      </w:pPr>
+      <w:r>
+        <w:t>会议主持人 Olivia 用真实会议的节奏推进：要数字、要 owner、要 deadline；反馈围绕「会议发言」给纠错与升级（结论先行、给选项、闭环行动项），而不是面试话术。</w:t>
+      </w:r>
+    </w:p>
+    <w:p>
+      <w:pPr>
+        <w:pStyle w:val="ListBullet"/>
+      </w:pPr>
+      <w:r>
+        <w:t>建议顺序：先刷通用 16 题打开会表达的骨架，再用行业 22 题练内容；每题都能配合「示范答案」与「照读示范」使用。</w:t>
       </w:r>
     </w:p>
     <w:p>
@@ -2137,7 +2223,7 @@
           <w:color w:val="6B7280"/>
           <w:sz w:val="18"/>
         </w:rPr>
-        <w:t>本项目基于 MIT 协议开源 · 问题反馈请提 GitHub Issue　| 　手册版本 2026-09（对应应用 v0.13）</w:t>
+        <w:t>本项目基于 MIT 协议开源 · 问题反馈请提 GitHub Issue　| 　手册版本 2026-09（对应应用 v0.16）</w:t>
       </w:r>
     </w:p>
     <w:sectPr>

</xml_diff>

<commit_message>
fix(v0.16.1): auto-fill missing question sets/personas on over-extract upgrade; WebView cache & temp files kept inside the app folder (delete folder = full uninstall); version in zip filenames; remove legacy vendor string from bundle
</commit_message>
<xml_diff>
--- a/docs/USER-GUIDE.docx
+++ b/docs/USER-GUIDE.docx
@@ -2171,6 +2171,50 @@
           </w:p>
         </w:tc>
       </w:tr>
+      <w:tr>
+        <w:tc>
+          <w:tcPr>
+            <w:tcW w:type="dxa" w:w="4819"/>
+          </w:tcPr>
+          <w:p>
+            <w:r>
+              <w:t>更新到新版本</w:t>
+            </w:r>
+          </w:p>
+        </w:tc>
+        <w:tc>
+          <w:tcPr>
+            <w:tcW w:type="dxa" w:w="4819"/>
+          </w:tcPr>
+          <w:p>
+            <w:r>
+              <w:t>推荐解压到新文件夹使用；也可直接覆盖旧文件夹再启动（v0.16.1 起会自动补齐新增题库 / 角色）。想保留练习记录与 Key：把旧文件夹的 data/、.env、config.local.yaml 复制到新文件夹</w:t>
+            </w:r>
+          </w:p>
+        </w:tc>
+      </w:tr>
+      <w:tr>
+        <w:tc>
+          <w:tcPr>
+            <w:tcW w:type="dxa" w:w="4819"/>
+          </w:tcPr>
+          <w:p>
+            <w:r>
+              <w:t>彻底卸载（Windows）</w:t>
+            </w:r>
+          </w:p>
+        </w:tc>
+        <w:tc>
+          <w:tcPr>
+            <w:tcW w:type="dxa" w:w="4819"/>
+          </w:tcPr>
+          <w:p>
+            <w:r>
+              <w:t>免安装绿色版：删除程序文件夹即完全卸载——API Key / 练习数据 / 配置全部在文件夹内，不会写入 C 盘用户目录。创建过桌面快捷方式请一并删除</w:t>
+            </w:r>
+          </w:p>
+        </w:tc>
+      </w:tr>
     </w:tbl>
     <w:p>
       <w:pPr>
@@ -2213,6 +2257,14 @@
       </w:r>
     </w:p>
     <w:p>
+      <w:pPr>
+        <w:pStyle w:val="ListBullet"/>
+      </w:pPr>
+      <w:r>
+        <w:t>Windows 免安装版：以上文件连同程序一起都在 exe 旁的文件夹内（含 .env / data / materials / logs / webview_data）——整个文件夹即全部数据，删除文件夹 = 完全卸载</w:t>
+      </w:r>
+    </w:p>
+    <w:p>
       <w:r>
         <w:t>更多文档：README（安装、模型需求与推荐）· docs/RUNBOOK.md（运行手册）。</w:t>
       </w:r>
@@ -2223,7 +2275,7 @@
           <w:color w:val="6B7280"/>
           <w:sz w:val="18"/>
         </w:rPr>
-        <w:t>本项目基于 MIT 协议开源 · 问题反馈请提 GitHub Issue　| 　手册版本 2026-09（对应应用 v0.16）</w:t>
+        <w:t>本项目基于 MIT 协议开源 · 问题反馈请提 GitHub Issue　| 　手册版本 2026-09（对应应用 v0.16.1）</w:t>
       </w:r>
     </w:p>
     <w:sectPr>

</xml_diff>

<commit_message>
docs: add lossless-upgrade guide (user guide section 6 + README zh/en); manual rebuilt (22 pp)
</commit_message>
<xml_diff>
--- a/docs/USER-GUIDE.docx
+++ b/docs/USER-GUIDE.docx
@@ -174,7 +174,18 @@
         <w:rPr>
           <w:sz w:val="21"/>
         </w:rPr>
-        <w:t>6  参考：快捷键与文件位置</w:t>
+        <w:t>6  更新与无损升级</w:t>
+      </w:r>
+    </w:p>
+    <w:p>
+      <w:pPr>
+        <w:spacing w:after="80"/>
+      </w:pPr>
+      <w:r>
+        <w:rPr>
+          <w:sz w:val="21"/>
+        </w:rPr>
+        <w:t>7  参考：快捷键与文件位置</w:t>
       </w:r>
     </w:p>
     <w:p>
@@ -2188,7 +2199,7 @@
           </w:tcPr>
           <w:p>
             <w:r>
-              <w:t>推荐解压到新文件夹使用；也可直接覆盖旧文件夹再启动（v0.16.1 起会自动补齐新增题库 / 角色）。想保留练习记录与 Key：把旧文件夹的 data/、.env、config.local.yaml 复制到新文件夹</w:t>
+              <w:t>见「6 更新与无损升级」：新版直接覆盖解压后启动 = 自动补齐新增题库 / 角色，不动你的文件；解压到新文件夹 + 复制 data/、.env、config.local.yaml（及 materials/ 里自加的文件）= 最稳妥，进度与配置完整保留</w:t>
             </w:r>
           </w:p>
         </w:tc>
@@ -2221,7 +2232,153 @@
         <w:pStyle w:val="Heading1"/>
       </w:pPr>
       <w:r>
-        <w:t>6  参考：快捷键与文件位置</w:t>
+        <w:t>6  更新与无损升级（保留进度与配置）</w:t>
+      </w:r>
+    </w:p>
+    <w:p>
+      <w:r>
+        <w:t>升级一个新版本，想让「新角色 / 新题库 / 修复」和你的全部练习进度、个性化配置同时到位、一个都不丢——按本章做即可。整个过程不需要重新配置，也不需要重新练任何一题。</w:t>
+      </w:r>
+    </w:p>
+    <w:p>
+      <w:pPr>
+        <w:pStyle w:val="Heading2"/>
+      </w:pPr>
+      <w:r>
+        <w:t>6.1  要保留的「四样东西」</w:t>
+      </w:r>
+    </w:p>
+    <w:p>
+      <w:pPr>
+        <w:pStyle w:val="ListBullet"/>
+      </w:pPr>
+      <w:r>
+        <w:t>data/ 文件夹 —— 全部练习进度：会话记录、收藏夹、错题本、复盘报告、录音与打卡统计</w:t>
+      </w:r>
+    </w:p>
+    <w:p>
+      <w:pPr>
+        <w:pStyle w:val="ListBullet"/>
+      </w:pPr>
+      <w:r>
+        <w:t>.env —— 你的 API Key 与接口地址</w:t>
+      </w:r>
+    </w:p>
+    <w:p>
+      <w:pPr>
+        <w:pStyle w:val="ListBullet"/>
+      </w:pPr>
+      <w:r>
+        <w:t>config.local.yaml —— 在「⚙️ 设置」里改过的内容：对话模型、音色、手机访问等</w:t>
+      </w:r>
+    </w:p>
+    <w:p>
+      <w:pPr>
+        <w:pStyle w:val="ListBullet"/>
+      </w:pPr>
+      <w:r>
+        <w:t>materials/ 里你自己加的文件 —— 导入的简历 materials/profile.md、自建题库 / 角色等</w:t>
+      </w:r>
+    </w:p>
+    <w:p>
+      <w:r>
+        <w:t>程序本体、内置题库、日志与缓存都不用管——它们随新版本自动更新。</w:t>
+      </w:r>
+    </w:p>
+    <w:p>
+      <w:pPr>
+        <w:pStyle w:val="Heading2"/>
+      </w:pPr>
+      <w:r>
+        <w:t>6.2  方式 A · 最稳（推荐）：解压到新文件夹 + 复制四样</w:t>
+      </w:r>
+    </w:p>
+    <w:p>
+      <w:r>
+        <w:t>1. 下载新版压缩包（文件名带版本号），解压到一个新文件夹；</w:t>
+      </w:r>
+    </w:p>
+    <w:p>
+      <w:r>
+        <w:t>2. 打开旧文件夹，把 data/、.env、config.local.yaml 复制到新文件夹（没有的文件跳过即可）；</w:t>
+      </w:r>
+    </w:p>
+    <w:p>
+      <w:r>
+        <w:t>3. 如果导入过简历或加过自定义素材：把旧文件夹 materials/ 里的 profile.md 等自加文件复制到新文件夹的 materials/ 里（新文件夹还没有 materials？先启动一次程序，它会自动生成）；</w:t>
+      </w:r>
+    </w:p>
+    <w:p>
+      <w:r>
+        <w:t>4. 打开新文件夹里的程序（Windows 双击 EnglishInterviewGym.exe / macOS 双击「启动.command」）。首次启动会自动补齐新增题库与角色；</w:t>
+      </w:r>
+    </w:p>
+    <w:p>
+      <w:r>
+        <w:t>5. 核对三件事：⚙️ 设置右下角版本号 = 新版本；首页「打卡 / 最近训练」能看到旧记录；题库列表出现新内容；</w:t>
+      </w:r>
+    </w:p>
+    <w:p>
+      <w:r>
+        <w:t>6. 确认无误后，旧文件夹建议先留一个版本周期做备份，之后再删除。</w:t>
+      </w:r>
+    </w:p>
+    <w:p>
+      <w:pPr>
+        <w:pStyle w:val="Heading2"/>
+      </w:pPr>
+      <w:r>
+        <w:t>6.3  方式 B · 最省事：直接覆盖解压</w:t>
+      </w:r>
+    </w:p>
+    <w:p>
+      <w:r>
+        <w:t>把新版压缩包直接解压到旧文件夹上（覆盖），再启动。v0.16.1 起，程序启动时会自动补齐缺失的新题库 / 角色，不会覆盖你的任何文件：进度、Key、设置、自定义素材原样保留；你手动改过的同名内置文件也保持你的版本。</w:t>
+      </w:r>
+    </w:p>
+    <w:p>
+      <w:pPr>
+        <w:pStyle w:val="Heading2"/>
+      </w:pPr>
+      <w:r>
+        <w:t>6.4  两个要避免的操作</w:t>
+      </w:r>
+    </w:p>
+    <w:p>
+      <w:pPr>
+        <w:pStyle w:val="ListBullet"/>
+      </w:pPr>
+      <w:r>
+        <w:t>删掉旧文件夹再解压新版——这等于「重置」：进度与配置会一起丢失；想保留请先备份 6.1 里的四样东西</w:t>
+      </w:r>
+    </w:p>
+    <w:p>
+      <w:pPr>
+        <w:pStyle w:val="ListBullet"/>
+      </w:pPr>
+      <w:r>
+        <w:t>把练习数据与配置留在旧文件夹不管、直接用全新文件夹开练——那是「全新开始」，旧进度要手动复制过去才会出现</w:t>
+      </w:r>
+    </w:p>
+    <w:p>
+      <w:pPr>
+        <w:pStyle w:val="Heading2"/>
+      </w:pPr>
+      <w:r>
+        <w:t>6.5  想「彻底重新开始」</w:t>
+      </w:r>
+    </w:p>
+    <w:p>
+      <w:r>
+        <w:t>删除程序文件夹后重新解压 = 全新开始；也可以只删 data/ 文件夹——Key 与设置保留，练习记录清零。</w:t>
+      </w:r>
+    </w:p>
+    <w:p>
+      <w:pPr>
+        <w:pStyle w:val="Heading1"/>
+      </w:pPr>
+      <w:r>
+        <w:t>7  参考：快捷键与文件位置</w:t>
       </w:r>
     </w:p>
     <w:p>

</xml_diff>